<commit_message>
Fix manuscript abstract formatting and regenerate docx outputs
Co-Authored-By: Tatsuki Onishi <bougtoir@gmail.com>
</commit_message>
<xml_diff>
--- a/cancer_screening_burden/manuscript/manuscript.docx
+++ b/cancer_screening_burden/manuscript/manuscript.docx
@@ -22,12 +22,6 @@
     <w:p>
       <w:r>
         <w:rPr>
-          <w:sz w:val="22"/>
-        </w:rPr>
-        <w:t>|</w:t>
-      </w:r>
-      <w:r>
-        <w:rPr>
           <w:b/>
           <w:sz w:val="22"/>
         </w:rPr>
@@ -41,12 +35,6 @@
       </w:r>
     </w:p>
     <w:p>
-      <w:r>
-        <w:rPr>
-          <w:sz w:val="22"/>
-        </w:rPr>
-        <w:t>|</w:t>
-      </w:r>
       <w:r>
         <w:rPr>
           <w:b/>
@@ -64,12 +52,6 @@
     <w:p>
       <w:r>
         <w:rPr>
-          <w:sz w:val="22"/>
-        </w:rPr>
-        <w:t>|</w:t>
-      </w:r>
-      <w:r>
-        <w:rPr>
           <w:b/>
           <w:sz w:val="22"/>
         </w:rPr>
@@ -85,12 +67,6 @@
     <w:p>
       <w:r>
         <w:rPr>
-          <w:sz w:val="22"/>
-        </w:rPr>
-        <w:t>|</w:t>
-      </w:r>
-      <w:r>
-        <w:rPr>
           <w:b/>
           <w:sz w:val="22"/>
         </w:rPr>
@@ -104,12 +80,6 @@
       </w:r>
     </w:p>
     <w:p>
-      <w:r>
-        <w:rPr>
-          <w:sz w:val="22"/>
-        </w:rPr>
-        <w:t>|</w:t>
-      </w:r>
       <w:r>
         <w:rPr>
           <w:b/>

</xml_diff>

<commit_message>
Fix Devin Review findings: FP-only specialist visits, reproducibility deps and README pipeline, PPV consistency
Co-Authored-By: Tatsuki Onishi <bougtoir@gmail.com>
</commit_message>
<xml_diff>
--- a/cancer_screening_burden/manuscript/manuscript.docx
+++ b/cancer_screening_burden/manuscript/manuscript.docx
@@ -61,7 +61,7 @@
         <w:rPr>
           <w:sz w:val="22"/>
         </w:rPr>
-        <w:t xml:space="preserve"> At 50% follow-up, a screening wave of 100,000 persons would generate 383.5 true positives and 7994.5 false positives (overall PPV 4.60%; FP/TP ratio 20.8). Total downstream visits would reach 15684.4, with maximum capacity utilisation 163.2% (specialist visits). The first illustrative capacity ceiling was exceeded at a follow-up rate of 40% (specialist total visits). PPV ranged from 0.70% (Ovarian) to 8.00% (Colorectal) across cancer types and was strongly age-dependent. Relative to the MHLW Patient Survey 2023 baseline case load, a 100,000-person DTC wave at 50% follow-up would add 184.3 specialist visits per relevant specialist, raising the effective cases per specialist from 35.1 to 219.4 (525% increase).</w:t>
+        <w:t xml:space="preserve"> At 50% follow-up, a screening wave of 100,000 persons would generate 383.5 true positives and 7994.5 false positives (overall PPV 4.58%; FP/TP ratio 20.8). Total downstream visits would reach 15684.4, with maximum capacity utilisation 163.2% (specialist visits). The first illustrative capacity ceiling was exceeded at a follow-up rate of 40% (specialist total visits). PPV ranged from 0.72% (Ovarian) to 7.99% (Colorectal) across cancer types and was strongly age-dependent. Relative to the MHLW Patient Survey 2023 baseline case load, a 100,000-person DTC wave at 50% follow-up would add 168.8 false-positive specialist visits per relevant specialist, raising the effective cases per specialist from 35.1 to 204.0 (481% increase).</w:t>
       </w:r>
     </w:p>
     <w:p>
@@ -1120,7 +1120,7 @@
         <w:rPr>
           <w:sz w:val="22"/>
         </w:rPr>
-        <w:t>At a 50% follow-up rate, the model estimated 383.5 true positives and 7994.5 false positives across all eight cancers (Table 2). Colorectal had the highest age-adjusted PPV (8.00%) and Ovarian the lowest (0.70%). The FP/TP ratio ranged from 11.5 to 137.4.</w:t>
+        <w:t>At a 50% follow-up rate, the model estimated 383.5 true positives and 7994.5 false positives across all eight cancers (Table 2). Colorectal had the highest age-adjusted PPV (7.99%) and Ovarian the lowest (0.72%). The FP/TP ratio ranged from 11.5 to 137.4.</w:t>
       </w:r>
     </w:p>
     <w:p>
@@ -1324,7 +1324,7 @@
               <w:rPr>
                 <w:sz w:val="20"/>
               </w:rPr>
-              <w:t>5.60</w:t>
+              <w:t>5.58</w:t>
             </w:r>
           </w:p>
         </w:tc>
@@ -1430,7 +1430,7 @@
               <w:rPr>
                 <w:sz w:val="20"/>
               </w:rPr>
-              <w:t>8.00</w:t>
+              <w:t>7.99</w:t>
             </w:r>
           </w:p>
         </w:tc>
@@ -1536,7 +1536,7 @@
               <w:rPr>
                 <w:sz w:val="20"/>
               </w:rPr>
-              <w:t>6.50</w:t>
+              <w:t>6.53</w:t>
             </w:r>
           </w:p>
         </w:tc>
@@ -1642,7 +1642,7 @@
               <w:rPr>
                 <w:sz w:val="20"/>
               </w:rPr>
-              <w:t>5.50</w:t>
+              <w:t>5.51</w:t>
             </w:r>
           </w:p>
         </w:tc>
@@ -1748,7 +1748,7 @@
               <w:rPr>
                 <w:sz w:val="20"/>
               </w:rPr>
-              <w:t>5.40</w:t>
+              <w:t>5.44</w:t>
             </w:r>
           </w:p>
         </w:tc>
@@ -1854,7 +1854,7 @@
               <w:rPr>
                 <w:sz w:val="20"/>
               </w:rPr>
-              <w:t>1.80</w:t>
+              <w:t>1.81</w:t>
             </w:r>
           </w:p>
         </w:tc>
@@ -1960,7 +1960,7 @@
               <w:rPr>
                 <w:sz w:val="20"/>
               </w:rPr>
-              <w:t>2.60</w:t>
+              <w:t>2.61</w:t>
             </w:r>
           </w:p>
         </w:tc>
@@ -2066,7 +2066,7 @@
               <w:rPr>
                 <w:sz w:val="20"/>
               </w:rPr>
-              <w:t>0.70</w:t>
+              <w:t>0.72</w:t>
             </w:r>
           </w:p>
         </w:tc>
@@ -2257,7 +2257,7 @@
         <w:rPr>
           <w:sz w:val="22"/>
         </w:rPr>
-        <w:t>Table 4 compares the MHLW Patient Survey 2023 baseline cancer case load per specialist with the additional specialist visits generated by a 100,000-person DTC wave at 50% follow-up. Across all cancer-relevant specialties, the baseline case load is about 35.1 patients per specialist; the DTC wave adds about 184.3 visits per specialist, an increase of 525%.</w:t>
+        <w:t>Table 4 compares the MHLW Patient Survey 2023 baseline cancer case load per specialist with the additional false-positive specialist visits generated by a 100,000-person DTC wave at 50% follow-up. Across all cancer-relevant specialties, the baseline case load is about 35.1 patients per specialist; the DTC wave adds about 168.8 false-positive specialist visits per specialist, an increase of 481%.</w:t>
       </w:r>
     </w:p>
     <w:p>
@@ -2336,7 +2336,7 @@
                 <w:b/>
                 <w:sz w:val="20"/>
               </w:rPr>
-              <w:t>FP visits per specialist (100k screened)</w:t>
+              <w:t>False-positive specialist visits per specialist</w:t>
             </w:r>
           </w:p>
         </w:tc>
@@ -2418,7 +2418,7 @@
               <w:rPr>
                 <w:sz w:val="20"/>
               </w:rPr>
-              <w:t>73.25</w:t>
+              <w:t>65.51</w:t>
             </w:r>
           </w:p>
         </w:tc>
@@ -2431,7 +2431,7 @@
               <w:rPr>
                 <w:sz w:val="20"/>
               </w:rPr>
-              <w:t>85.1</w:t>
+              <w:t>77.4</w:t>
             </w:r>
           </w:p>
         </w:tc>
@@ -2444,7 +2444,7 @@
               <w:rPr>
                 <w:sz w:val="20"/>
               </w:rPr>
-              <w:t>618.0</w:t>
+              <w:t>552.7</w:t>
             </w:r>
           </w:p>
         </w:tc>
@@ -2498,7 +2498,7 @@
               <w:rPr>
                 <w:sz w:val="20"/>
               </w:rPr>
-              <w:t>205.25</w:t>
+              <w:t>174.89</w:t>
             </w:r>
           </w:p>
         </w:tc>
@@ -2511,7 +2511,7 @@
               <w:rPr>
                 <w:sz w:val="20"/>
               </w:rPr>
-              <w:t>268.7</w:t>
+              <w:t>238.3</w:t>
             </w:r>
           </w:p>
         </w:tc>
@@ -2524,7 +2524,7 @@
               <w:rPr>
                 <w:sz w:val="20"/>
               </w:rPr>
-              <w:t>323.6</w:t>
+              <w:t>275.7</w:t>
             </w:r>
           </w:p>
         </w:tc>
@@ -2578,7 +2578,7 @@
               <w:rPr>
                 <w:sz w:val="20"/>
               </w:rPr>
-              <w:t>279.66</w:t>
+              <w:t>245.38</w:t>
             </w:r>
           </w:p>
         </w:tc>
@@ -2591,7 +2591,7 @@
               <w:rPr>
                 <w:sz w:val="20"/>
               </w:rPr>
-              <w:t>323.5</w:t>
+              <w:t>289.2</w:t>
             </w:r>
           </w:p>
         </w:tc>
@@ -2604,7 +2604,7 @@
               <w:rPr>
                 <w:sz w:val="20"/>
               </w:rPr>
-              <w:t>637.8</w:t>
+              <w:t>559.6</w:t>
             </w:r>
           </w:p>
         </w:tc>
@@ -2658,7 +2658,7 @@
               <w:rPr>
                 <w:sz w:val="20"/>
               </w:rPr>
-              <w:t>892.48</w:t>
+              <w:t>799.33</w:t>
             </w:r>
           </w:p>
         </w:tc>
@@ -2671,7 +2671,7 @@
               <w:rPr>
                 <w:sz w:val="20"/>
               </w:rPr>
-              <w:t>1296.0</w:t>
+              <w:t>1202.8</w:t>
             </w:r>
           </w:p>
         </w:tc>
@@ -2684,7 +2684,7 @@
               <w:rPr>
                 <w:sz w:val="20"/>
               </w:rPr>
-              <w:t>221.2</w:t>
+              <w:t>198.1</w:t>
             </w:r>
           </w:p>
         </w:tc>
@@ -2738,7 +2738,7 @@
               <w:rPr>
                 <w:sz w:val="20"/>
               </w:rPr>
-              <w:t>241.77</w:t>
+              <w:t>221.40</w:t>
             </w:r>
           </w:p>
         </w:tc>
@@ -2751,7 +2751,7 @@
               <w:rPr>
                 <w:sz w:val="20"/>
               </w:rPr>
-              <w:t>327.3</w:t>
+              <w:t>306.9</w:t>
             </w:r>
           </w:p>
         </w:tc>
@@ -2764,7 +2764,7 @@
               <w:rPr>
                 <w:sz w:val="20"/>
               </w:rPr>
-              <w:t>282.7</w:t>
+              <w:t>258.9</w:t>
             </w:r>
           </w:p>
         </w:tc>
@@ -2818,7 +2818,7 @@
               <w:rPr>
                 <w:sz w:val="20"/>
               </w:rPr>
-              <w:t>201.38</w:t>
+              <w:t>194.25</w:t>
             </w:r>
           </w:p>
         </w:tc>
@@ -2831,7 +2831,7 @@
               <w:rPr>
                 <w:sz w:val="20"/>
               </w:rPr>
-              <w:t>211.5</w:t>
+              <w:t>204.4</w:t>
             </w:r>
           </w:p>
         </w:tc>
@@ -2844,7 +2844,7 @@
               <w:rPr>
                 <w:sz w:val="20"/>
               </w:rPr>
-              <w:t>1989.0</w:t>
+              <w:t>1918.5</w:t>
             </w:r>
           </w:p>
         </w:tc>
@@ -2898,7 +2898,7 @@
               <w:rPr>
                 <w:sz w:val="20"/>
               </w:rPr>
-              <w:t>82.86</w:t>
+              <w:t>78.65</w:t>
             </w:r>
           </w:p>
         </w:tc>
@@ -2911,7 +2911,7 @@
               <w:rPr>
                 <w:sz w:val="20"/>
               </w:rPr>
-              <w:t>86.6</w:t>
+              <w:t>82.4</w:t>
             </w:r>
           </w:p>
         </w:tc>
@@ -2924,7 +2924,7 @@
               <w:rPr>
                 <w:sz w:val="20"/>
               </w:rPr>
-              <w:t>2207.1</w:t>
+              <w:t>2095.0</w:t>
             </w:r>
           </w:p>
         </w:tc>
@@ -2978,7 +2978,7 @@
               <w:rPr>
                 <w:sz w:val="20"/>
               </w:rPr>
-              <w:t>86.07</w:t>
+              <w:t>84.85</w:t>
             </w:r>
           </w:p>
         </w:tc>
@@ -2991,7 +2991,7 @@
               <w:rPr>
                 <w:sz w:val="20"/>
               </w:rPr>
-              <w:t>88.2</w:t>
+              <w:t>87.0</w:t>
             </w:r>
           </w:p>
         </w:tc>
@@ -3004,7 +3004,7 @@
               <w:rPr>
                 <w:sz w:val="20"/>
               </w:rPr>
-              <w:t>3941.5</w:t>
+              <w:t>3885.6</w:t>
             </w:r>
           </w:p>
         </w:tc>
@@ -3302,7 +3302,7 @@
               <w:rPr>
                 <w:sz w:val="20"/>
               </w:rPr>
-              <w:t>4.60</w:t>
+              <w:t>4.58</w:t>
             </w:r>
           </w:p>
         </w:tc>
@@ -3408,7 +3408,7 @@
               <w:rPr>
                 <w:sz w:val="20"/>
               </w:rPr>
-              <w:t>4.60</w:t>
+              <w:t>4.58</w:t>
             </w:r>
           </w:p>
         </w:tc>
@@ -3514,7 +3514,7 @@
               <w:rPr>
                 <w:sz w:val="20"/>
               </w:rPr>
-              <w:t>4.60</w:t>
+              <w:t>4.58</w:t>
             </w:r>
           </w:p>
         </w:tc>
@@ -3620,7 +3620,7 @@
               <w:rPr>
                 <w:sz w:val="20"/>
               </w:rPr>
-              <w:t>4.60</w:t>
+              <w:t>4.58</w:t>
             </w:r>
           </w:p>
         </w:tc>
@@ -3726,7 +3726,7 @@
               <w:rPr>
                 <w:sz w:val="20"/>
               </w:rPr>
-              <w:t>4.60</w:t>
+              <w:t>4.58</w:t>
             </w:r>
           </w:p>
         </w:tc>
@@ -3832,7 +3832,7 @@
               <w:rPr>
                 <w:sz w:val="20"/>
               </w:rPr>
-              <w:t>4.60</w:t>
+              <w:t>4.58</w:t>
             </w:r>
           </w:p>
         </w:tc>
@@ -3938,7 +3938,7 @@
               <w:rPr>
                 <w:sz w:val="20"/>
               </w:rPr>
-              <w:t>4.60</w:t>
+              <w:t>4.58</w:t>
             </w:r>
           </w:p>
         </w:tc>
@@ -4044,7 +4044,7 @@
               <w:rPr>
                 <w:sz w:val="20"/>
               </w:rPr>
-              <w:t>4.60</w:t>
+              <w:t>4.58</w:t>
             </w:r>
           </w:p>
         </w:tc>
@@ -4150,7 +4150,7 @@
               <w:rPr>
                 <w:sz w:val="20"/>
               </w:rPr>
-              <w:t>4.60</w:t>
+              <w:t>4.58</w:t>
             </w:r>
           </w:p>
         </w:tc>
@@ -4256,7 +4256,7 @@
               <w:rPr>
                 <w:sz w:val="20"/>
               </w:rPr>
-              <w:t>4.60</w:t>
+              <w:t>4.58</w:t>
             </w:r>
           </w:p>
         </w:tc>
@@ -4362,7 +4362,7 @@
               <w:rPr>
                 <w:sz w:val="20"/>
               </w:rPr>
-              <w:t>4.60</w:t>
+              <w:t>4.58</w:t>
             </w:r>
           </w:p>
         </w:tc>
@@ -4479,7 +4479,7 @@
         <w:rPr>
           <w:sz w:val="22"/>
         </w:rPr>
-        <w:t>Our scenario model shows that, even under optimistic assumptions for test accuracy, a DTC blood-based MCED screening wave can produce roughly 21 false-positive workups for every true cancer detected. At 50% follow-up the illustrative specialist capacity ceiling is exceeded by 63.2 percentage points, and the effective case load per cancer-relevant specialist rises by about 525%. The burden is not uniform: cancers with low prevalence (ovarian, liver, pancreatic) had the lowest PPV and the highest FP/TP ratios, while age strongly modulates PPV.</w:t>
+        <w:t>Our scenario model shows that, even under optimistic assumptions for test accuracy, a DTC blood-based MCED screening wave can produce roughly 21 false-positive workups for every true cancer detected. At 50% follow-up the illustrative specialist capacity ceiling is exceeded by 63.2 percentage points, and the effective case load per cancer-relevant specialist rises by about 481% due to false-positive follow-up visits. The burden is not uniform: cancers with low prevalence (ovarian, liver, pancreatic) had the lowest PPV and the highest FP/TP ratios, while age strongly modulates PPV.</w:t>
       </w:r>
     </w:p>
     <w:p>

</xml_diff>

<commit_message>
Remove in Japan from title and reduce Japan/CJK in manuscript body
Co-Authored-By: Tatsuki Onishi <bougtoir@gmail.com>
</commit_message>
<xml_diff>
--- a/cancer_screening_burden/manuscript/manuscript.docx
+++ b/cancer_screening_burden/manuscript/manuscript.docx
@@ -8,7 +8,7 @@
         <w:jc w:val="center"/>
       </w:pPr>
       <w:r>
-        <w:t>False-positive cascade and healthcare capacity burden of direct-to-consumer multi-cancer early detection blood tests in Japan: a scenario modelling study</w:t>
+        <w:t>False-positive cascade and healthcare capacity burden of direct-to-consumer multi-cancer early detection blood tests: a scenario modelling study</w:t>
       </w:r>
     </w:p>
     <w:p>
@@ -46,7 +46,7 @@
         <w:rPr>
           <w:sz w:val="22"/>
         </w:rPr>
-        <w:t xml:space="preserve"> We built a deterministic expected-value model parameterised with 2023 Japanese adult cancer incidence rates, 2023 population counts, and 2023 national medical-facility diagnostic volumes. Specialist capacity was additionally derived from NDB Open Data outpatient patient counts and JMSB specialist counts. We estimated true positives, false positives, downstream visits, capacity utilisation, and the per-specialist case load across follow-up rates of 0–100% and specificities of 95.0–99.9%.</w:t>
+        <w:t xml:space="preserve"> We built a deterministic expected-value model parameterised with 2023 adult cancer incidence rates, 2023 population counts, and 2023 national medical-facility diagnostic volumes. Specialist capacity was additionally derived from NDB Open Data outpatient patient counts and JMSB specialist counts. We estimated true positives, false positives, downstream visits, capacity utilisation, and the per-specialist case load across follow-up rates of 0–100% and specificities of 95.0–99.9%.</w:t>
       </w:r>
     </w:p>
     <w:p>
@@ -76,7 +76,7 @@
         <w:rPr>
           <w:sz w:val="22"/>
         </w:rPr>
-        <w:t xml:space="preserve"> Even with optimistic 99% specificity, a DTC MCED wave can trigger a false-positive cascade that exceeds Japanese outpatient and endoscopic capacity. Regulatory guardrails on performance claims, follow-up obligations, and reporting are needed before routine adoption.</w:t>
+        <w:t xml:space="preserve"> Even with optimistic 99% specificity, a DTC MCED wave can trigger a false-positive cascade that exceeds outpatient and endoscopic capacity. Regulatory guardrails on performance claims, follow-up obligations, and reporting are needed before routine adoption.</w:t>
       </w:r>
     </w:p>
     <w:p>
@@ -91,7 +91,7 @@
         <w:rPr>
           <w:sz w:val="22"/>
         </w:rPr>
-        <w:t xml:space="preserve"> multi-cancer early detection, false positive, healthcare capacity, direct-to-consumer testing, Japan, scenario model</w:t>
+        <w:t xml:space="preserve"> multi-cancer early detection, false positive, healthcare capacity, direct-to-consumer testing, scenario model</w:t>
       </w:r>
     </w:p>
     <w:p>
@@ -145,7 +145,7 @@
         <w:rPr>
           <w:sz w:val="22"/>
         </w:rPr>
-        <w:t xml:space="preserve">. In Japan, where endoscopy and specialist visits are already constrained </w:t>
+        <w:t xml:space="preserve">. In this setting, where endoscopy and specialist visits are already constrained </w:t>
       </w:r>
       <w:r>
         <w:rPr>
@@ -182,7 +182,7 @@
         <w:rPr>
           <w:sz w:val="22"/>
         </w:rPr>
-        <w:t xml:space="preserve">Cancer incidence by site, age, sex, and calendar year (2023) and the corresponding 2023 Japanese population by age and sex were taken from the National Cancer Center of Japan </w:t>
+        <w:t xml:space="preserve">Cancer incidence by site, age, sex, and calendar year (2023) and the corresponding 2023 population by age and sex were taken from the National Cancer Center of Japan </w:t>
       </w:r>
       <w:r>
         <w:rPr>
@@ -249,7 +249,7 @@
         <w:rPr>
           <w:sz w:val="22"/>
         </w:rPr>
-        <w:t xml:space="preserve">Specialist capacity was defined using NDB Open Data first/revisit outpatient patient counts and Japanese Board of Medical Specialties specialist counts (JMSB概報, digitised by 内科専攻医net) </w:t>
+        <w:t xml:space="preserve">Specialist capacity was defined using NDB Open Data first/revisit outpatient patient counts and Japanese Board of Medical Specialties specialist counts </w:t>
       </w:r>
       <w:r>
         <w:rPr>
@@ -4532,7 +4532,7 @@
         <w:rPr>
           <w:sz w:val="22"/>
         </w:rPr>
-        <w:t>Without regulatory guardrails—clear performance thresholds, transparent PPV reporting, and follow-up obligations—direct-to-consumer MCED tests risk converting a marketing promise into a large-scale false-positive cascade that stresses Japan’s diagnostic capacity.</w:t>
+        <w:t>Without regulatory guardrails—clear performance thresholds, transparent PPV reporting, and follow-up obligations—direct-to-consumer MCED tests risk converting a marketing promise into a large-scale false-positive cascade that stresses diagnostic capacity.</w:t>
       </w:r>
     </w:p>
     <w:p>
@@ -4604,7 +4604,7 @@
         <w:rPr>
           <w:sz w:val="22"/>
         </w:rPr>
-        <w:t>8. Japanese Board of Medical Specialties. Summary of the Japanese specialist system (日本専門医制度概報), as tabulated by 内科専攻医net. https://senkoi.net/650/ and https://senkoi.net/778/</w:t>
+        <w:t>8. Japanese Board of Medical Specialties. Summary of the Japanese specialist system, as tabulated by senkoi.net. https://senkoi.net/650/ and https://senkoi.net/778/</w:t>
       </w:r>
     </w:p>
     <w:sectPr>

</xml_diff>

<commit_message>
Implement reviewer-proposed FMCH fit improvements: primary care model, multi-way sensitivity, age scenarios, supplementary tables/figures
Co-Authored-By: Tatsuki Onishi <bougtoir@gmail.com>
</commit_message>
<xml_diff>
--- a/cancer_screening_burden/manuscript/manuscript.docx
+++ b/cancer_screening_burden/manuscript/manuscript.docx
@@ -61,7 +61,7 @@
         <w:rPr>
           <w:sz w:val="22"/>
         </w:rPr>
-        <w:t xml:space="preserve"> At 50% follow-up, a screening wave of 100,000 persons would generate 383.5 true positives and 7994.5 false positives (overall PPV 4.58%; FP/TP ratio 20.8). Total downstream visits would reach 15684.4, with maximum capacity utilisation 163.2% (specialist visits). The first illustrative capacity ceiling was exceeded at a follow-up rate of 40% (specialist total visits). PPV ranged from 0.72% (Ovarian) to 7.99% (Colorectal) across cancer types and was strongly age-dependent. Relative to the MHLW Patient Survey 2023 baseline case load, a 100,000-person DTC wave at 50% follow-up would add 168.8 false-positive specialist visits per relevant specialist, raising the effective cases per specialist from 35.1 to 204.0 (481% increase).</w:t>
+        <w:t xml:space="preserve"> At 50% follow-up, a screening wave of 100,000 persons would generate 383.5 true positives and 7994.5 false positives (overall PPV 4.58%; FP/TP ratio 20.8). Total downstream visits would reach 19873.4, with maximum capacity utilisation 163.2% (specialist visits). The first illustrative capacity ceiling was exceeded at a follow-up rate of 40% (specialist total visits). PPV ranged from 0.72% (Ovarian) to 7.99% (Colorectal) across cancer types and was strongly age-dependent. Relative to the MHLW Patient Survey 2023 baseline case load, a 100,000-person DTC wave at 50% follow-up would add 168.8 false-positive specialist visits per relevant specialist, raising the effective cases per specialist from 35.1 to 204.0 (481% increase).</w:t>
       </w:r>
     </w:p>
     <w:p>
@@ -339,7 +339,7 @@
         <w:rPr>
           <w:sz w:val="22"/>
         </w:rPr>
-        <w:t>Each positive individual who followed up (follow-up rate, 0–100%) generated visits to CT, MRI, endoscopy, and specialist care according to cancer-specific pathway probabilities. Additional visits per true and false positive were added. Capacity utilisation for each resource was calculated as total visits divided by the annual capacity per 100,000 population. A full description of equations is available in `simulate.py`.</w:t>
+        <w:t>Each positive individual who followed up (follow-up rate, 0–100%) generated a primary care visit plus visits to CT, MRI, endoscopy, and specialist care according to cancer-specific pathway probabilities. Additional visits per true and false positive were added. Capacity utilisation for each resource was calculated as total visits divided by the annual capacity per 100,000 population. A full description of equations is available in `simulate.py`.</w:t>
       </w:r>
     </w:p>
     <w:p>
@@ -355,7 +355,7 @@
         <w:pStyle w:val="Heading3"/>
       </w:pPr>
       <w:r>
-        <w:t>Specialist capacity definition</w:t>
+        <w:t>Specialist and primary care capacity definition</w:t>
       </w:r>
     </w:p>
     <w:p>
@@ -363,7 +363,7 @@
         <w:rPr>
           <w:sz w:val="22"/>
         </w:rPr>
-        <w:t xml:space="preserve">We define baseline specialist capacity as the annual outpatient caseload per cancer-relevant specialist. We used NDB Open Data unique first/revisit outpatient patients (April 2024–March 2025) divided by the total number of basic JMSB specialists, giving an average annual caseload per specialist </w:t>
+        <w:t xml:space="preserve">Baseline specialist capacity is defined as the annual outpatient caseload per cancer-relevant specialist. NDB Open Data unique first/revisit outpatient patient counts were used (April 2024–March 2025) divided by the total number of basic JMSB specialists, giving an average annual caseload per specialist </w:t>
       </w:r>
       <w:r>
         <w:rPr>
@@ -383,7 +383,15 @@
         <w:rPr>
           <w:sz w:val="22"/>
         </w:rPr>
-        <w:t>. We then multiplied this by the number of cancer-relevant specialists per 100,000 population and applied the same 20% share assumed available for a DTC wave. The resulting `specialist_visits_per_year` is an illustrative capacity ceiling for a 100,000-person cohort.</w:t>
+        <w:t>. This value was then multiplied by the number of cancer-relevant specialists per 100,000 population and applied the same 20% share assumed available for a DTC wave. The resulting `specialist_visits_per_year` is an illustrative capacity ceiling for a 100,000-person cohort.</w:t>
+      </w:r>
+    </w:p>
+    <w:p>
+      <w:r>
+        <w:rPr>
+          <w:sz w:val="22"/>
+        </w:rPr>
+        <w:t>The same approach was applied to primary care (internal medicine and general practice) specialists to derive `primary_care_visits_per_year`.</w:t>
       </w:r>
     </w:p>
     <w:p>
@@ -787,6 +795,47 @@
               <w:rPr>
                 <w:sz w:val="20"/>
               </w:rPr>
+              <w:t>Primary care capacity per 100k per year</w:t>
+            </w:r>
+          </w:p>
+        </w:tc>
+        <w:tc>
+          <w:tcPr>
+            <w:tcW w:type="dxa" w:w="2880"/>
+          </w:tcPr>
+          <w:p>
+            <w:r>
+              <w:rPr>
+                <w:sz w:val="20"/>
+              </w:rPr>
+              <w:t>11983</w:t>
+            </w:r>
+          </w:p>
+        </w:tc>
+        <w:tc>
+          <w:tcPr>
+            <w:tcW w:type="dxa" w:w="2880"/>
+          </w:tcPr>
+          <w:p>
+            <w:r>
+              <w:rPr>
+                <w:sz w:val="20"/>
+              </w:rPr>
+              <w:t>Derived from NDB Open Data first/revisit outpatient patient counts (88,408,837 + 85,182,008) and 131,981 primary-care-relevant JMSB specialists (internal medicine and general practice); 20% share assumed available for new cancer workups.</w:t>
+            </w:r>
+          </w:p>
+        </w:tc>
+      </w:tr>
+      <w:tr>
+        <w:tc>
+          <w:tcPr>
+            <w:tcW w:type="dxa" w:w="2880"/>
+          </w:tcPr>
+          <w:p>
+            <w:r>
+              <w:rPr>
+                <w:sz w:val="20"/>
+              </w:rPr>
               <w:t>Gastric prevalence (per 100k)</w:t>
             </w:r>
           </w:p>
@@ -1139,19 +1188,20 @@
         <w:tblLook w:firstColumn="1" w:firstRow="1" w:lastColumn="0" w:lastRow="0" w:noHBand="0" w:noVBand="1" w:val="04A0"/>
       </w:tblPr>
       <w:tblGrid>
-        <w:gridCol w:w="1080"/>
-        <w:gridCol w:w="1080"/>
-        <w:gridCol w:w="1080"/>
-        <w:gridCol w:w="1080"/>
-        <w:gridCol w:w="1080"/>
-        <w:gridCol w:w="1080"/>
-        <w:gridCol w:w="1080"/>
-        <w:gridCol w:w="1080"/>
+        <w:gridCol w:w="960"/>
+        <w:gridCol w:w="960"/>
+        <w:gridCol w:w="960"/>
+        <w:gridCol w:w="960"/>
+        <w:gridCol w:w="960"/>
+        <w:gridCol w:w="960"/>
+        <w:gridCol w:w="960"/>
+        <w:gridCol w:w="960"/>
+        <w:gridCol w:w="960"/>
       </w:tblGrid>
       <w:tr>
         <w:tc>
           <w:tcPr>
-            <w:tcW w:type="dxa" w:w="1080"/>
+            <w:tcW w:type="dxa" w:w="960"/>
           </w:tcPr>
           <w:p>
             <w:r>
@@ -1165,7 +1215,7 @@
         </w:tc>
         <w:tc>
           <w:tcPr>
-            <w:tcW w:type="dxa" w:w="1080"/>
+            <w:tcW w:type="dxa" w:w="960"/>
           </w:tcPr>
           <w:p>
             <w:r>
@@ -1179,7 +1229,7 @@
         </w:tc>
         <w:tc>
           <w:tcPr>
-            <w:tcW w:type="dxa" w:w="1080"/>
+            <w:tcW w:type="dxa" w:w="960"/>
           </w:tcPr>
           <w:p>
             <w:r>
@@ -1193,7 +1243,7 @@
         </w:tc>
         <w:tc>
           <w:tcPr>
-            <w:tcW w:type="dxa" w:w="1080"/>
+            <w:tcW w:type="dxa" w:w="960"/>
           </w:tcPr>
           <w:p>
             <w:r>
@@ -1207,7 +1257,7 @@
         </w:tc>
         <w:tc>
           <w:tcPr>
-            <w:tcW w:type="dxa" w:w="1080"/>
+            <w:tcW w:type="dxa" w:w="960"/>
           </w:tcPr>
           <w:p>
             <w:r>
@@ -1221,7 +1271,7 @@
         </w:tc>
         <w:tc>
           <w:tcPr>
-            <w:tcW w:type="dxa" w:w="1080"/>
+            <w:tcW w:type="dxa" w:w="960"/>
           </w:tcPr>
           <w:p>
             <w:r>
@@ -1235,7 +1285,7 @@
         </w:tc>
         <w:tc>
           <w:tcPr>
-            <w:tcW w:type="dxa" w:w="1080"/>
+            <w:tcW w:type="dxa" w:w="960"/>
           </w:tcPr>
           <w:p>
             <w:r>
@@ -1243,13 +1293,27 @@
                 <w:b/>
                 <w:sz w:val="20"/>
               </w:rPr>
+              <w:t>Primary care visits</w:t>
+            </w:r>
+          </w:p>
+        </w:tc>
+        <w:tc>
+          <w:tcPr>
+            <w:tcW w:type="dxa" w:w="960"/>
+          </w:tcPr>
+          <w:p>
+            <w:r>
+              <w:rPr>
+                <w:b/>
+                <w:sz w:val="20"/>
+              </w:rPr>
               <w:t>Total visits</w:t>
             </w:r>
           </w:p>
         </w:tc>
         <w:tc>
           <w:tcPr>
-            <w:tcW w:type="dxa" w:w="1080"/>
+            <w:tcW w:type="dxa" w:w="960"/>
           </w:tcPr>
           <w:p>
             <w:r>
@@ -1265,7 +1329,7 @@
       <w:tr>
         <w:tc>
           <w:tcPr>
-            <w:tcW w:type="dxa" w:w="1080"/>
+            <w:tcW w:type="dxa" w:w="960"/>
           </w:tcPr>
           <w:p>
             <w:r>
@@ -1278,7 +1342,7 @@
         </w:tc>
         <w:tc>
           <w:tcPr>
-            <w:tcW w:type="dxa" w:w="1080"/>
+            <w:tcW w:type="dxa" w:w="960"/>
           </w:tcPr>
           <w:p>
             <w:r>
@@ -1291,7 +1355,7 @@
         </w:tc>
         <w:tc>
           <w:tcPr>
-            <w:tcW w:type="dxa" w:w="1080"/>
+            <w:tcW w:type="dxa" w:w="960"/>
           </w:tcPr>
           <w:p>
             <w:r>
@@ -1304,7 +1368,7 @@
         </w:tc>
         <w:tc>
           <w:tcPr>
-            <w:tcW w:type="dxa" w:w="1080"/>
+            <w:tcW w:type="dxa" w:w="960"/>
           </w:tcPr>
           <w:p>
             <w:r>
@@ -1317,7 +1381,7 @@
         </w:tc>
         <w:tc>
           <w:tcPr>
-            <w:tcW w:type="dxa" w:w="1080"/>
+            <w:tcW w:type="dxa" w:w="960"/>
           </w:tcPr>
           <w:p>
             <w:r>
@@ -1330,7 +1394,7 @@
         </w:tc>
         <w:tc>
           <w:tcPr>
-            <w:tcW w:type="dxa" w:w="1080"/>
+            <w:tcW w:type="dxa" w:w="960"/>
           </w:tcPr>
           <w:p>
             <w:r>
@@ -1343,20 +1407,33 @@
         </w:tc>
         <w:tc>
           <w:tcPr>
-            <w:tcW w:type="dxa" w:w="1080"/>
-          </w:tcPr>
-          <w:p>
-            <w:r>
-              <w:rPr>
-                <w:sz w:val="20"/>
-              </w:rPr>
-              <w:t>2084.3</w:t>
-            </w:r>
-          </w:p>
-        </w:tc>
-        <w:tc>
-          <w:tcPr>
-            <w:tcW w:type="dxa" w:w="1080"/>
+            <w:tcW w:type="dxa" w:w="960"/>
+          </w:tcPr>
+          <w:p>
+            <w:r>
+              <w:rPr>
+                <w:sz w:val="20"/>
+              </w:rPr>
+              <w:t>529.1</w:t>
+            </w:r>
+          </w:p>
+        </w:tc>
+        <w:tc>
+          <w:tcPr>
+            <w:tcW w:type="dxa" w:w="960"/>
+          </w:tcPr>
+          <w:p>
+            <w:r>
+              <w:rPr>
+                <w:sz w:val="20"/>
+              </w:rPr>
+              <w:t>2613.4</w:t>
+            </w:r>
+          </w:p>
+        </w:tc>
+        <w:tc>
+          <w:tcPr>
+            <w:tcW w:type="dxa" w:w="960"/>
           </w:tcPr>
           <w:p>
             <w:r>
@@ -1371,7 +1448,7 @@
       <w:tr>
         <w:tc>
           <w:tcPr>
-            <w:tcW w:type="dxa" w:w="1080"/>
+            <w:tcW w:type="dxa" w:w="960"/>
           </w:tcPr>
           <w:p>
             <w:r>
@@ -1384,7 +1461,7 @@
         </w:tc>
         <w:tc>
           <w:tcPr>
-            <w:tcW w:type="dxa" w:w="1080"/>
+            <w:tcW w:type="dxa" w:w="960"/>
           </w:tcPr>
           <w:p>
             <w:r>
@@ -1397,7 +1474,7 @@
         </w:tc>
         <w:tc>
           <w:tcPr>
-            <w:tcW w:type="dxa" w:w="1080"/>
+            <w:tcW w:type="dxa" w:w="960"/>
           </w:tcPr>
           <w:p>
             <w:r>
@@ -1410,7 +1487,7 @@
         </w:tc>
         <w:tc>
           <w:tcPr>
-            <w:tcW w:type="dxa" w:w="1080"/>
+            <w:tcW w:type="dxa" w:w="960"/>
           </w:tcPr>
           <w:p>
             <w:r>
@@ -1423,7 +1500,7 @@
         </w:tc>
         <w:tc>
           <w:tcPr>
-            <w:tcW w:type="dxa" w:w="1080"/>
+            <w:tcW w:type="dxa" w:w="960"/>
           </w:tcPr>
           <w:p>
             <w:r>
@@ -1436,7 +1513,7 @@
         </w:tc>
         <w:tc>
           <w:tcPr>
-            <w:tcW w:type="dxa" w:w="1080"/>
+            <w:tcW w:type="dxa" w:w="960"/>
           </w:tcPr>
           <w:p>
             <w:r>
@@ -1449,20 +1526,33 @@
         </w:tc>
         <w:tc>
           <w:tcPr>
-            <w:tcW w:type="dxa" w:w="1080"/>
-          </w:tcPr>
-          <w:p>
-            <w:r>
-              <w:rPr>
-                <w:sz w:val="20"/>
-              </w:rPr>
-              <w:t>2170.7</w:t>
-            </w:r>
-          </w:p>
-        </w:tc>
-        <w:tc>
-          <w:tcPr>
-            <w:tcW w:type="dxa" w:w="1080"/>
+            <w:tcW w:type="dxa" w:w="960"/>
+          </w:tcPr>
+          <w:p>
+            <w:r>
+              <w:rPr>
+                <w:sz w:val="20"/>
+              </w:rPr>
+              <w:t>542.7</w:t>
+            </w:r>
+          </w:p>
+        </w:tc>
+        <w:tc>
+          <w:tcPr>
+            <w:tcW w:type="dxa" w:w="960"/>
+          </w:tcPr>
+          <w:p>
+            <w:r>
+              <w:rPr>
+                <w:sz w:val="20"/>
+              </w:rPr>
+              <w:t>2713.4</w:t>
+            </w:r>
+          </w:p>
+        </w:tc>
+        <w:tc>
+          <w:tcPr>
+            <w:tcW w:type="dxa" w:w="960"/>
           </w:tcPr>
           <w:p>
             <w:r>
@@ -1477,7 +1567,7 @@
       <w:tr>
         <w:tc>
           <w:tcPr>
-            <w:tcW w:type="dxa" w:w="1080"/>
+            <w:tcW w:type="dxa" w:w="960"/>
           </w:tcPr>
           <w:p>
             <w:r>
@@ -1490,7 +1580,7 @@
         </w:tc>
         <w:tc>
           <w:tcPr>
-            <w:tcW w:type="dxa" w:w="1080"/>
+            <w:tcW w:type="dxa" w:w="960"/>
           </w:tcPr>
           <w:p>
             <w:r>
@@ -1503,7 +1593,7 @@
         </w:tc>
         <w:tc>
           <w:tcPr>
-            <w:tcW w:type="dxa" w:w="1080"/>
+            <w:tcW w:type="dxa" w:w="960"/>
           </w:tcPr>
           <w:p>
             <w:r>
@@ -1516,7 +1606,7 @@
         </w:tc>
         <w:tc>
           <w:tcPr>
-            <w:tcW w:type="dxa" w:w="1080"/>
+            <w:tcW w:type="dxa" w:w="960"/>
           </w:tcPr>
           <w:p>
             <w:r>
@@ -1529,7 +1619,7 @@
         </w:tc>
         <w:tc>
           <w:tcPr>
-            <w:tcW w:type="dxa" w:w="1080"/>
+            <w:tcW w:type="dxa" w:w="960"/>
           </w:tcPr>
           <w:p>
             <w:r>
@@ -1542,7 +1632,7 @@
         </w:tc>
         <w:tc>
           <w:tcPr>
-            <w:tcW w:type="dxa" w:w="1080"/>
+            <w:tcW w:type="dxa" w:w="960"/>
           </w:tcPr>
           <w:p>
             <w:r>
@@ -1555,20 +1645,33 @@
         </w:tc>
         <w:tc>
           <w:tcPr>
-            <w:tcW w:type="dxa" w:w="1080"/>
-          </w:tcPr>
-          <w:p>
-            <w:r>
-              <w:rPr>
-                <w:sz w:val="20"/>
-              </w:rPr>
-              <w:t>2295.7</w:t>
-            </w:r>
-          </w:p>
-        </w:tc>
-        <w:tc>
-          <w:tcPr>
-            <w:tcW w:type="dxa" w:w="1080"/>
+            <w:tcW w:type="dxa" w:w="960"/>
+          </w:tcPr>
+          <w:p>
+            <w:r>
+              <w:rPr>
+                <w:sz w:val="20"/>
+              </w:rPr>
+              <w:t>534.4</w:t>
+            </w:r>
+          </w:p>
+        </w:tc>
+        <w:tc>
+          <w:tcPr>
+            <w:tcW w:type="dxa" w:w="960"/>
+          </w:tcPr>
+          <w:p>
+            <w:r>
+              <w:rPr>
+                <w:sz w:val="20"/>
+              </w:rPr>
+              <w:t>2830.1</w:t>
+            </w:r>
+          </w:p>
+        </w:tc>
+        <w:tc>
+          <w:tcPr>
+            <w:tcW w:type="dxa" w:w="960"/>
           </w:tcPr>
           <w:p>
             <w:r>
@@ -1583,7 +1686,7 @@
       <w:tr>
         <w:tc>
           <w:tcPr>
-            <w:tcW w:type="dxa" w:w="1080"/>
+            <w:tcW w:type="dxa" w:w="960"/>
           </w:tcPr>
           <w:p>
             <w:r>
@@ -1596,7 +1699,7 @@
         </w:tc>
         <w:tc>
           <w:tcPr>
-            <w:tcW w:type="dxa" w:w="1080"/>
+            <w:tcW w:type="dxa" w:w="960"/>
           </w:tcPr>
           <w:p>
             <w:r>
@@ -1609,7 +1712,7 @@
         </w:tc>
         <w:tc>
           <w:tcPr>
-            <w:tcW w:type="dxa" w:w="1080"/>
+            <w:tcW w:type="dxa" w:w="960"/>
           </w:tcPr>
           <w:p>
             <w:r>
@@ -1622,7 +1725,7 @@
         </w:tc>
         <w:tc>
           <w:tcPr>
-            <w:tcW w:type="dxa" w:w="1080"/>
+            <w:tcW w:type="dxa" w:w="960"/>
           </w:tcPr>
           <w:p>
             <w:r>
@@ -1635,7 +1738,7 @@
         </w:tc>
         <w:tc>
           <w:tcPr>
-            <w:tcW w:type="dxa" w:w="1080"/>
+            <w:tcW w:type="dxa" w:w="960"/>
           </w:tcPr>
           <w:p>
             <w:r>
@@ -1648,7 +1751,7 @@
         </w:tc>
         <w:tc>
           <w:tcPr>
-            <w:tcW w:type="dxa" w:w="1080"/>
+            <w:tcW w:type="dxa" w:w="960"/>
           </w:tcPr>
           <w:p>
             <w:r>
@@ -1661,20 +1764,33 @@
         </w:tc>
         <w:tc>
           <w:tcPr>
-            <w:tcW w:type="dxa" w:w="1080"/>
-          </w:tcPr>
-          <w:p>
-            <w:r>
-              <w:rPr>
-                <w:sz w:val="20"/>
-              </w:rPr>
-              <w:t>1632.4</w:t>
-            </w:r>
-          </w:p>
-        </w:tc>
-        <w:tc>
-          <w:tcPr>
-            <w:tcW w:type="dxa" w:w="1080"/>
+            <w:tcW w:type="dxa" w:w="960"/>
+          </w:tcPr>
+          <w:p>
+            <w:r>
+              <w:rPr>
+                <w:sz w:val="20"/>
+              </w:rPr>
+              <w:t>528.7</w:t>
+            </w:r>
+          </w:p>
+        </w:tc>
+        <w:tc>
+          <w:tcPr>
+            <w:tcW w:type="dxa" w:w="960"/>
+          </w:tcPr>
+          <w:p>
+            <w:r>
+              <w:rPr>
+                <w:sz w:val="20"/>
+              </w:rPr>
+              <w:t>2161.1</w:t>
+            </w:r>
+          </w:p>
+        </w:tc>
+        <w:tc>
+          <w:tcPr>
+            <w:tcW w:type="dxa" w:w="960"/>
           </w:tcPr>
           <w:p>
             <w:r>
@@ -1689,7 +1805,7 @@
       <w:tr>
         <w:tc>
           <w:tcPr>
-            <w:tcW w:type="dxa" w:w="1080"/>
+            <w:tcW w:type="dxa" w:w="960"/>
           </w:tcPr>
           <w:p>
             <w:r>
@@ -1702,7 +1818,7 @@
         </w:tc>
         <w:tc>
           <w:tcPr>
-            <w:tcW w:type="dxa" w:w="1080"/>
+            <w:tcW w:type="dxa" w:w="960"/>
           </w:tcPr>
           <w:p>
             <w:r>
@@ -1715,7 +1831,7 @@
         </w:tc>
         <w:tc>
           <w:tcPr>
-            <w:tcW w:type="dxa" w:w="1080"/>
+            <w:tcW w:type="dxa" w:w="960"/>
           </w:tcPr>
           <w:p>
             <w:r>
@@ -1728,7 +1844,7 @@
         </w:tc>
         <w:tc>
           <w:tcPr>
-            <w:tcW w:type="dxa" w:w="1080"/>
+            <w:tcW w:type="dxa" w:w="960"/>
           </w:tcPr>
           <w:p>
             <w:r>
@@ -1741,7 +1857,7 @@
         </w:tc>
         <w:tc>
           <w:tcPr>
-            <w:tcW w:type="dxa" w:w="1080"/>
+            <w:tcW w:type="dxa" w:w="960"/>
           </w:tcPr>
           <w:p>
             <w:r>
@@ -1754,7 +1870,7 @@
         </w:tc>
         <w:tc>
           <w:tcPr>
-            <w:tcW w:type="dxa" w:w="1080"/>
+            <w:tcW w:type="dxa" w:w="960"/>
           </w:tcPr>
           <w:p>
             <w:r>
@@ -1767,20 +1883,33 @@
         </w:tc>
         <w:tc>
           <w:tcPr>
-            <w:tcW w:type="dxa" w:w="1080"/>
-          </w:tcPr>
-          <w:p>
-            <w:r>
-              <w:rPr>
-                <w:sz w:val="20"/>
-              </w:rPr>
-              <w:t>1654.5</w:t>
-            </w:r>
-          </w:p>
-        </w:tc>
-        <w:tc>
-          <w:tcPr>
-            <w:tcW w:type="dxa" w:w="1080"/>
+            <w:tcW w:type="dxa" w:w="960"/>
+          </w:tcPr>
+          <w:p>
+            <w:r>
+              <w:rPr>
+                <w:sz w:val="20"/>
+              </w:rPr>
+              <w:t>528.3</w:t>
+            </w:r>
+          </w:p>
+        </w:tc>
+        <w:tc>
+          <w:tcPr>
+            <w:tcW w:type="dxa" w:w="960"/>
+          </w:tcPr>
+          <w:p>
+            <w:r>
+              <w:rPr>
+                <w:sz w:val="20"/>
+              </w:rPr>
+              <w:t>2182.8</w:t>
+            </w:r>
+          </w:p>
+        </w:tc>
+        <w:tc>
+          <w:tcPr>
+            <w:tcW w:type="dxa" w:w="960"/>
           </w:tcPr>
           <w:p>
             <w:r>
@@ -1795,7 +1924,7 @@
       <w:tr>
         <w:tc>
           <w:tcPr>
-            <w:tcW w:type="dxa" w:w="1080"/>
+            <w:tcW w:type="dxa" w:w="960"/>
           </w:tcPr>
           <w:p>
             <w:r>
@@ -1808,7 +1937,7 @@
         </w:tc>
         <w:tc>
           <w:tcPr>
-            <w:tcW w:type="dxa" w:w="1080"/>
+            <w:tcW w:type="dxa" w:w="960"/>
           </w:tcPr>
           <w:p>
             <w:r>
@@ -1821,7 +1950,7 @@
         </w:tc>
         <w:tc>
           <w:tcPr>
-            <w:tcW w:type="dxa" w:w="1080"/>
+            <w:tcW w:type="dxa" w:w="960"/>
           </w:tcPr>
           <w:p>
             <w:r>
@@ -1834,7 +1963,7 @@
         </w:tc>
         <w:tc>
           <w:tcPr>
-            <w:tcW w:type="dxa" w:w="1080"/>
+            <w:tcW w:type="dxa" w:w="960"/>
           </w:tcPr>
           <w:p>
             <w:r>
@@ -1847,7 +1976,7 @@
         </w:tc>
         <w:tc>
           <w:tcPr>
-            <w:tcW w:type="dxa" w:w="1080"/>
+            <w:tcW w:type="dxa" w:w="960"/>
           </w:tcPr>
           <w:p>
             <w:r>
@@ -1860,7 +1989,7 @@
         </w:tc>
         <w:tc>
           <w:tcPr>
-            <w:tcW w:type="dxa" w:w="1080"/>
+            <w:tcW w:type="dxa" w:w="960"/>
           </w:tcPr>
           <w:p>
             <w:r>
@@ -1873,20 +2002,33 @@
         </w:tc>
         <w:tc>
           <w:tcPr>
-            <w:tcW w:type="dxa" w:w="1080"/>
-          </w:tcPr>
-          <w:p>
-            <w:r>
-              <w:rPr>
-                <w:sz w:val="20"/>
-              </w:rPr>
-              <w:t>1702.8</w:t>
-            </w:r>
-          </w:p>
-        </w:tc>
-        <w:tc>
-          <w:tcPr>
-            <w:tcW w:type="dxa" w:w="1080"/>
+            <w:tcW w:type="dxa" w:w="960"/>
+          </w:tcPr>
+          <w:p>
+            <w:r>
+              <w:rPr>
+                <w:sz w:val="20"/>
+              </w:rPr>
+              <w:t>509.0</w:t>
+            </w:r>
+          </w:p>
+        </w:tc>
+        <w:tc>
+          <w:tcPr>
+            <w:tcW w:type="dxa" w:w="960"/>
+          </w:tcPr>
+          <w:p>
+            <w:r>
+              <w:rPr>
+                <w:sz w:val="20"/>
+              </w:rPr>
+              <w:t>2211.9</w:t>
+            </w:r>
+          </w:p>
+        </w:tc>
+        <w:tc>
+          <w:tcPr>
+            <w:tcW w:type="dxa" w:w="960"/>
           </w:tcPr>
           <w:p>
             <w:r>
@@ -1901,7 +2043,7 @@
       <w:tr>
         <w:tc>
           <w:tcPr>
-            <w:tcW w:type="dxa" w:w="1080"/>
+            <w:tcW w:type="dxa" w:w="960"/>
           </w:tcPr>
           <w:p>
             <w:r>
@@ -1914,7 +2056,7 @@
         </w:tc>
         <w:tc>
           <w:tcPr>
-            <w:tcW w:type="dxa" w:w="1080"/>
+            <w:tcW w:type="dxa" w:w="960"/>
           </w:tcPr>
           <w:p>
             <w:r>
@@ -1927,7 +2069,7 @@
         </w:tc>
         <w:tc>
           <w:tcPr>
-            <w:tcW w:type="dxa" w:w="1080"/>
+            <w:tcW w:type="dxa" w:w="960"/>
           </w:tcPr>
           <w:p>
             <w:r>
@@ -1940,7 +2082,7 @@
         </w:tc>
         <w:tc>
           <w:tcPr>
-            <w:tcW w:type="dxa" w:w="1080"/>
+            <w:tcW w:type="dxa" w:w="960"/>
           </w:tcPr>
           <w:p>
             <w:r>
@@ -1953,7 +2095,7 @@
         </w:tc>
         <w:tc>
           <w:tcPr>
-            <w:tcW w:type="dxa" w:w="1080"/>
+            <w:tcW w:type="dxa" w:w="960"/>
           </w:tcPr>
           <w:p>
             <w:r>
@@ -1966,7 +2108,7 @@
         </w:tc>
         <w:tc>
           <w:tcPr>
-            <w:tcW w:type="dxa" w:w="1080"/>
+            <w:tcW w:type="dxa" w:w="960"/>
           </w:tcPr>
           <w:p>
             <w:r>
@@ -1979,20 +2121,33 @@
         </w:tc>
         <w:tc>
           <w:tcPr>
-            <w:tcW w:type="dxa" w:w="1080"/>
-          </w:tcPr>
-          <w:p>
-            <w:r>
-              <w:rPr>
-                <w:sz w:val="20"/>
-              </w:rPr>
-              <w:t>2144.1</w:t>
-            </w:r>
-          </w:p>
-        </w:tc>
-        <w:tc>
-          <w:tcPr>
-            <w:tcW w:type="dxa" w:w="1080"/>
+            <w:tcW w:type="dxa" w:w="960"/>
+          </w:tcPr>
+          <w:p>
+            <w:r>
+              <w:rPr>
+                <w:sz w:val="20"/>
+              </w:rPr>
+              <w:t>513.2</w:t>
+            </w:r>
+          </w:p>
+        </w:tc>
+        <w:tc>
+          <w:tcPr>
+            <w:tcW w:type="dxa" w:w="960"/>
+          </w:tcPr>
+          <w:p>
+            <w:r>
+              <w:rPr>
+                <w:sz w:val="20"/>
+              </w:rPr>
+              <w:t>2657.3</w:t>
+            </w:r>
+          </w:p>
+        </w:tc>
+        <w:tc>
+          <w:tcPr>
+            <w:tcW w:type="dxa" w:w="960"/>
           </w:tcPr>
           <w:p>
             <w:r>
@@ -2007,7 +2162,7 @@
       <w:tr>
         <w:tc>
           <w:tcPr>
-            <w:tcW w:type="dxa" w:w="1080"/>
+            <w:tcW w:type="dxa" w:w="960"/>
           </w:tcPr>
           <w:p>
             <w:r>
@@ -2020,7 +2175,7 @@
         </w:tc>
         <w:tc>
           <w:tcPr>
-            <w:tcW w:type="dxa" w:w="1080"/>
+            <w:tcW w:type="dxa" w:w="960"/>
           </w:tcPr>
           <w:p>
             <w:r>
@@ -2033,7 +2188,7 @@
         </w:tc>
         <w:tc>
           <w:tcPr>
-            <w:tcW w:type="dxa" w:w="1080"/>
+            <w:tcW w:type="dxa" w:w="960"/>
           </w:tcPr>
           <w:p>
             <w:r>
@@ -2046,7 +2201,7 @@
         </w:tc>
         <w:tc>
           <w:tcPr>
-            <w:tcW w:type="dxa" w:w="1080"/>
+            <w:tcW w:type="dxa" w:w="960"/>
           </w:tcPr>
           <w:p>
             <w:r>
@@ -2059,7 +2214,7 @@
         </w:tc>
         <w:tc>
           <w:tcPr>
-            <w:tcW w:type="dxa" w:w="1080"/>
+            <w:tcW w:type="dxa" w:w="960"/>
           </w:tcPr>
           <w:p>
             <w:r>
@@ -2072,7 +2227,7 @@
         </w:tc>
         <w:tc>
           <w:tcPr>
-            <w:tcW w:type="dxa" w:w="1080"/>
+            <w:tcW w:type="dxa" w:w="960"/>
           </w:tcPr>
           <w:p>
             <w:r>
@@ -2085,20 +2240,33 @@
         </w:tc>
         <w:tc>
           <w:tcPr>
-            <w:tcW w:type="dxa" w:w="1080"/>
-          </w:tcPr>
-          <w:p>
-            <w:r>
-              <w:rPr>
-                <w:sz w:val="20"/>
-              </w:rPr>
-              <w:t>1999.8</w:t>
-            </w:r>
-          </w:p>
-        </w:tc>
-        <w:tc>
-          <w:tcPr>
-            <w:tcW w:type="dxa" w:w="1080"/>
+            <w:tcW w:type="dxa" w:w="960"/>
+          </w:tcPr>
+          <w:p>
+            <w:r>
+              <w:rPr>
+                <w:sz w:val="20"/>
+              </w:rPr>
+              <w:t>503.5</w:t>
+            </w:r>
+          </w:p>
+        </w:tc>
+        <w:tc>
+          <w:tcPr>
+            <w:tcW w:type="dxa" w:w="960"/>
+          </w:tcPr>
+          <w:p>
+            <w:r>
+              <w:rPr>
+                <w:sz w:val="20"/>
+              </w:rPr>
+              <w:t>2503.3</w:t>
+            </w:r>
+          </w:p>
+        </w:tc>
+        <w:tc>
+          <w:tcPr>
+            <w:tcW w:type="dxa" w:w="960"/>
           </w:tcPr>
           <w:p>
             <w:r>
@@ -2125,7 +2293,7 @@
         <w:rPr>
           <w:sz w:val="22"/>
         </w:rPr>
-        <w:t>Total downstream visits rose from 0.0 at 0% follow-up to 31368.8 at 100% follow-up (Fig. 1). Resource utilisation is shown in Fig. 2. The first illustrative capacity ceiling was exceeded at 40% (specialist total visits). At 50% follow-up maximum utilisation was 163.2%.</w:t>
+        <w:t>Total downstream visits rose from 0.0 at 0% follow-up to 39746.8 at 100% follow-up (Fig. 1). At 50% follow-up this included 4189.0 primary care visits (35.0% of the illustrative primary-care capacity). Resource utilisation by modality is shown in Fig. 2. The first illustrative capacity ceiling was exceeded at 40% (specialist total visits). At 50% follow-up maximum utilisation was 163.2%.</w:t>
       </w:r>
     </w:p>
     <w:p>
@@ -2183,7 +2351,7 @@
         <w:rPr>
           <w:sz w:val="20"/>
         </w:rPr>
-        <w:t xml:space="preserve"> Total downstream diagnostic and specialist visits generated by a blood-based MCED screening wave of 100,000 persons, by follow-up rate.</w:t>
+        <w:t xml:space="preserve"> Total downstream diagnostic, primary care, and specialist visits generated by a blood-based MCED screening wave of 100,000 persons, by follow-up rate.</w:t>
       </w:r>
     </w:p>
     <w:p>
@@ -2241,7 +2409,7 @@
         <w:rPr>
           <w:sz w:val="20"/>
         </w:rPr>
-        <w:t xml:space="preserve"> Capacity utilisation (%) for CT, MRI, endoscopy, and specialist visits as follow-up rate increases. Values above 100% indicate demand exceeding the illustrative annual capacity available for a DTC screening wave.</w:t>
+        <w:t xml:space="preserve"> Capacity utilisation (%) for CT, MRI, endoscopy, specialist, and primary care visits as follow-up rate increases. Values above 100% indicate demand exceeding the illustrative annual capacity available for a DTC screening wave.</w:t>
       </w:r>
     </w:p>
     <w:p>
@@ -3117,19 +3285,20 @@
         <w:tblLook w:firstColumn="1" w:firstRow="1" w:lastColumn="0" w:lastRow="0" w:noHBand="0" w:noVBand="1" w:val="04A0"/>
       </w:tblPr>
       <w:tblGrid>
-        <w:gridCol w:w="1080"/>
-        <w:gridCol w:w="1080"/>
-        <w:gridCol w:w="1080"/>
-        <w:gridCol w:w="1080"/>
-        <w:gridCol w:w="1080"/>
-        <w:gridCol w:w="1080"/>
-        <w:gridCol w:w="1080"/>
-        <w:gridCol w:w="1080"/>
+        <w:gridCol w:w="960"/>
+        <w:gridCol w:w="960"/>
+        <w:gridCol w:w="960"/>
+        <w:gridCol w:w="960"/>
+        <w:gridCol w:w="960"/>
+        <w:gridCol w:w="960"/>
+        <w:gridCol w:w="960"/>
+        <w:gridCol w:w="960"/>
+        <w:gridCol w:w="960"/>
       </w:tblGrid>
       <w:tr>
         <w:tc>
           <w:tcPr>
-            <w:tcW w:type="dxa" w:w="1080"/>
+            <w:tcW w:type="dxa" w:w="960"/>
           </w:tcPr>
           <w:p>
             <w:r>
@@ -3143,7 +3312,7 @@
         </w:tc>
         <w:tc>
           <w:tcPr>
-            <w:tcW w:type="dxa" w:w="1080"/>
+            <w:tcW w:type="dxa" w:w="960"/>
           </w:tcPr>
           <w:p>
             <w:r>
@@ -3157,7 +3326,7 @@
         </w:tc>
         <w:tc>
           <w:tcPr>
-            <w:tcW w:type="dxa" w:w="1080"/>
+            <w:tcW w:type="dxa" w:w="960"/>
           </w:tcPr>
           <w:p>
             <w:r>
@@ -3171,7 +3340,7 @@
         </w:tc>
         <w:tc>
           <w:tcPr>
-            <w:tcW w:type="dxa" w:w="1080"/>
+            <w:tcW w:type="dxa" w:w="960"/>
           </w:tcPr>
           <w:p>
             <w:r>
@@ -3185,7 +3354,7 @@
         </w:tc>
         <w:tc>
           <w:tcPr>
-            <w:tcW w:type="dxa" w:w="1080"/>
+            <w:tcW w:type="dxa" w:w="960"/>
           </w:tcPr>
           <w:p>
             <w:r>
@@ -3199,7 +3368,7 @@
         </w:tc>
         <w:tc>
           <w:tcPr>
-            <w:tcW w:type="dxa" w:w="1080"/>
+            <w:tcW w:type="dxa" w:w="960"/>
           </w:tcPr>
           <w:p>
             <w:r>
@@ -3213,7 +3382,7 @@
         </w:tc>
         <w:tc>
           <w:tcPr>
-            <w:tcW w:type="dxa" w:w="1080"/>
+            <w:tcW w:type="dxa" w:w="960"/>
           </w:tcPr>
           <w:p>
             <w:r>
@@ -3221,13 +3390,27 @@
                 <w:b/>
                 <w:sz w:val="20"/>
               </w:rPr>
+              <w:t>Primary care visits</w:t>
+            </w:r>
+          </w:p>
+        </w:tc>
+        <w:tc>
+          <w:tcPr>
+            <w:tcW w:type="dxa" w:w="960"/>
+          </w:tcPr>
+          <w:p>
+            <w:r>
+              <w:rPr>
+                <w:b/>
+                <w:sz w:val="20"/>
+              </w:rPr>
               <w:t>Total visits</w:t>
             </w:r>
           </w:p>
         </w:tc>
         <w:tc>
           <w:tcPr>
-            <w:tcW w:type="dxa" w:w="1080"/>
+            <w:tcW w:type="dxa" w:w="960"/>
           </w:tcPr>
           <w:p>
             <w:r>
@@ -3243,7 +3426,7 @@
       <w:tr>
         <w:tc>
           <w:tcPr>
-            <w:tcW w:type="dxa" w:w="1080"/>
+            <w:tcW w:type="dxa" w:w="960"/>
           </w:tcPr>
           <w:p>
             <w:r>
@@ -3256,7 +3439,7 @@
         </w:tc>
         <w:tc>
           <w:tcPr>
-            <w:tcW w:type="dxa" w:w="1080"/>
+            <w:tcW w:type="dxa" w:w="960"/>
           </w:tcPr>
           <w:p>
             <w:r>
@@ -3269,7 +3452,7 @@
         </w:tc>
         <w:tc>
           <w:tcPr>
-            <w:tcW w:type="dxa" w:w="1080"/>
+            <w:tcW w:type="dxa" w:w="960"/>
           </w:tcPr>
           <w:p>
             <w:r>
@@ -3282,7 +3465,7 @@
         </w:tc>
         <w:tc>
           <w:tcPr>
-            <w:tcW w:type="dxa" w:w="1080"/>
+            <w:tcW w:type="dxa" w:w="960"/>
           </w:tcPr>
           <w:p>
             <w:r>
@@ -3295,7 +3478,7 @@
         </w:tc>
         <w:tc>
           <w:tcPr>
-            <w:tcW w:type="dxa" w:w="1080"/>
+            <w:tcW w:type="dxa" w:w="960"/>
           </w:tcPr>
           <w:p>
             <w:r>
@@ -3308,7 +3491,7 @@
         </w:tc>
         <w:tc>
           <w:tcPr>
-            <w:tcW w:type="dxa" w:w="1080"/>
+            <w:tcW w:type="dxa" w:w="960"/>
           </w:tcPr>
           <w:p>
             <w:r>
@@ -3321,7 +3504,7 @@
         </w:tc>
         <w:tc>
           <w:tcPr>
-            <w:tcW w:type="dxa" w:w="1080"/>
+            <w:tcW w:type="dxa" w:w="960"/>
           </w:tcPr>
           <w:p>
             <w:r>
@@ -3334,7 +3517,20 @@
         </w:tc>
         <w:tc>
           <w:tcPr>
-            <w:tcW w:type="dxa" w:w="1080"/>
+            <w:tcW w:type="dxa" w:w="960"/>
+          </w:tcPr>
+          <w:p>
+            <w:r>
+              <w:rPr>
+                <w:sz w:val="20"/>
+              </w:rPr>
+              <w:t>0.0</w:t>
+            </w:r>
+          </w:p>
+        </w:tc>
+        <w:tc>
+          <w:tcPr>
+            <w:tcW w:type="dxa" w:w="960"/>
           </w:tcPr>
           <w:p>
             <w:r>
@@ -3349,7 +3545,7 @@
       <w:tr>
         <w:tc>
           <w:tcPr>
-            <w:tcW w:type="dxa" w:w="1080"/>
+            <w:tcW w:type="dxa" w:w="960"/>
           </w:tcPr>
           <w:p>
             <w:r>
@@ -3362,7 +3558,7 @@
         </w:tc>
         <w:tc>
           <w:tcPr>
-            <w:tcW w:type="dxa" w:w="1080"/>
+            <w:tcW w:type="dxa" w:w="960"/>
           </w:tcPr>
           <w:p>
             <w:r>
@@ -3375,7 +3571,7 @@
         </w:tc>
         <w:tc>
           <w:tcPr>
-            <w:tcW w:type="dxa" w:w="1080"/>
+            <w:tcW w:type="dxa" w:w="960"/>
           </w:tcPr>
           <w:p>
             <w:r>
@@ -3388,7 +3584,7 @@
         </w:tc>
         <w:tc>
           <w:tcPr>
-            <w:tcW w:type="dxa" w:w="1080"/>
+            <w:tcW w:type="dxa" w:w="960"/>
           </w:tcPr>
           <w:p>
             <w:r>
@@ -3401,7 +3597,7 @@
         </w:tc>
         <w:tc>
           <w:tcPr>
-            <w:tcW w:type="dxa" w:w="1080"/>
+            <w:tcW w:type="dxa" w:w="960"/>
           </w:tcPr>
           <w:p>
             <w:r>
@@ -3414,7 +3610,7 @@
         </w:tc>
         <w:tc>
           <w:tcPr>
-            <w:tcW w:type="dxa" w:w="1080"/>
+            <w:tcW w:type="dxa" w:w="960"/>
           </w:tcPr>
           <w:p>
             <w:r>
@@ -3427,20 +3623,33 @@
         </w:tc>
         <w:tc>
           <w:tcPr>
-            <w:tcW w:type="dxa" w:w="1080"/>
-          </w:tcPr>
-          <w:p>
-            <w:r>
-              <w:rPr>
-                <w:sz w:val="20"/>
-              </w:rPr>
-              <w:t>3136.9</w:t>
-            </w:r>
-          </w:p>
-        </w:tc>
-        <w:tc>
-          <w:tcPr>
-            <w:tcW w:type="dxa" w:w="1080"/>
+            <w:tcW w:type="dxa" w:w="960"/>
+          </w:tcPr>
+          <w:p>
+            <w:r>
+              <w:rPr>
+                <w:sz w:val="20"/>
+              </w:rPr>
+              <w:t>837.8</w:t>
+            </w:r>
+          </w:p>
+        </w:tc>
+        <w:tc>
+          <w:tcPr>
+            <w:tcW w:type="dxa" w:w="960"/>
+          </w:tcPr>
+          <w:p>
+            <w:r>
+              <w:rPr>
+                <w:sz w:val="20"/>
+              </w:rPr>
+              <w:t>3974.7</w:t>
+            </w:r>
+          </w:p>
+        </w:tc>
+        <w:tc>
+          <w:tcPr>
+            <w:tcW w:type="dxa" w:w="960"/>
           </w:tcPr>
           <w:p>
             <w:r>
@@ -3455,7 +3664,7 @@
       <w:tr>
         <w:tc>
           <w:tcPr>
-            <w:tcW w:type="dxa" w:w="1080"/>
+            <w:tcW w:type="dxa" w:w="960"/>
           </w:tcPr>
           <w:p>
             <w:r>
@@ -3468,7 +3677,7 @@
         </w:tc>
         <w:tc>
           <w:tcPr>
-            <w:tcW w:type="dxa" w:w="1080"/>
+            <w:tcW w:type="dxa" w:w="960"/>
           </w:tcPr>
           <w:p>
             <w:r>
@@ -3481,7 +3690,7 @@
         </w:tc>
         <w:tc>
           <w:tcPr>
-            <w:tcW w:type="dxa" w:w="1080"/>
+            <w:tcW w:type="dxa" w:w="960"/>
           </w:tcPr>
           <w:p>
             <w:r>
@@ -3494,7 +3703,7 @@
         </w:tc>
         <w:tc>
           <w:tcPr>
-            <w:tcW w:type="dxa" w:w="1080"/>
+            <w:tcW w:type="dxa" w:w="960"/>
           </w:tcPr>
           <w:p>
             <w:r>
@@ -3507,7 +3716,7 @@
         </w:tc>
         <w:tc>
           <w:tcPr>
-            <w:tcW w:type="dxa" w:w="1080"/>
+            <w:tcW w:type="dxa" w:w="960"/>
           </w:tcPr>
           <w:p>
             <w:r>
@@ -3520,7 +3729,7 @@
         </w:tc>
         <w:tc>
           <w:tcPr>
-            <w:tcW w:type="dxa" w:w="1080"/>
+            <w:tcW w:type="dxa" w:w="960"/>
           </w:tcPr>
           <w:p>
             <w:r>
@@ -3533,20 +3742,33 @@
         </w:tc>
         <w:tc>
           <w:tcPr>
-            <w:tcW w:type="dxa" w:w="1080"/>
-          </w:tcPr>
-          <w:p>
-            <w:r>
-              <w:rPr>
-                <w:sz w:val="20"/>
-              </w:rPr>
-              <w:t>6273.8</w:t>
-            </w:r>
-          </w:p>
-        </w:tc>
-        <w:tc>
-          <w:tcPr>
-            <w:tcW w:type="dxa" w:w="1080"/>
+            <w:tcW w:type="dxa" w:w="960"/>
+          </w:tcPr>
+          <w:p>
+            <w:r>
+              <w:rPr>
+                <w:sz w:val="20"/>
+              </w:rPr>
+              <w:t>1675.6</w:t>
+            </w:r>
+          </w:p>
+        </w:tc>
+        <w:tc>
+          <w:tcPr>
+            <w:tcW w:type="dxa" w:w="960"/>
+          </w:tcPr>
+          <w:p>
+            <w:r>
+              <w:rPr>
+                <w:sz w:val="20"/>
+              </w:rPr>
+              <w:t>7949.4</w:t>
+            </w:r>
+          </w:p>
+        </w:tc>
+        <w:tc>
+          <w:tcPr>
+            <w:tcW w:type="dxa" w:w="960"/>
           </w:tcPr>
           <w:p>
             <w:r>
@@ -3561,7 +3783,7 @@
       <w:tr>
         <w:tc>
           <w:tcPr>
-            <w:tcW w:type="dxa" w:w="1080"/>
+            <w:tcW w:type="dxa" w:w="960"/>
           </w:tcPr>
           <w:p>
             <w:r>
@@ -3574,7 +3796,7 @@
         </w:tc>
         <w:tc>
           <w:tcPr>
-            <w:tcW w:type="dxa" w:w="1080"/>
+            <w:tcW w:type="dxa" w:w="960"/>
           </w:tcPr>
           <w:p>
             <w:r>
@@ -3587,7 +3809,7 @@
         </w:tc>
         <w:tc>
           <w:tcPr>
-            <w:tcW w:type="dxa" w:w="1080"/>
+            <w:tcW w:type="dxa" w:w="960"/>
           </w:tcPr>
           <w:p>
             <w:r>
@@ -3600,7 +3822,7 @@
         </w:tc>
         <w:tc>
           <w:tcPr>
-            <w:tcW w:type="dxa" w:w="1080"/>
+            <w:tcW w:type="dxa" w:w="960"/>
           </w:tcPr>
           <w:p>
             <w:r>
@@ -3613,7 +3835,7 @@
         </w:tc>
         <w:tc>
           <w:tcPr>
-            <w:tcW w:type="dxa" w:w="1080"/>
+            <w:tcW w:type="dxa" w:w="960"/>
           </w:tcPr>
           <w:p>
             <w:r>
@@ -3626,7 +3848,7 @@
         </w:tc>
         <w:tc>
           <w:tcPr>
-            <w:tcW w:type="dxa" w:w="1080"/>
+            <w:tcW w:type="dxa" w:w="960"/>
           </w:tcPr>
           <w:p>
             <w:r>
@@ -3639,20 +3861,33 @@
         </w:tc>
         <w:tc>
           <w:tcPr>
-            <w:tcW w:type="dxa" w:w="1080"/>
-          </w:tcPr>
-          <w:p>
-            <w:r>
-              <w:rPr>
-                <w:sz w:val="20"/>
-              </w:rPr>
-              <w:t>9410.6</w:t>
-            </w:r>
-          </w:p>
-        </w:tc>
-        <w:tc>
-          <w:tcPr>
-            <w:tcW w:type="dxa" w:w="1080"/>
+            <w:tcW w:type="dxa" w:w="960"/>
+          </w:tcPr>
+          <w:p>
+            <w:r>
+              <w:rPr>
+                <w:sz w:val="20"/>
+              </w:rPr>
+              <w:t>2513.4</w:t>
+            </w:r>
+          </w:p>
+        </w:tc>
+        <w:tc>
+          <w:tcPr>
+            <w:tcW w:type="dxa" w:w="960"/>
+          </w:tcPr>
+          <w:p>
+            <w:r>
+              <w:rPr>
+                <w:sz w:val="20"/>
+              </w:rPr>
+              <w:t>11924.0</w:t>
+            </w:r>
+          </w:p>
+        </w:tc>
+        <w:tc>
+          <w:tcPr>
+            <w:tcW w:type="dxa" w:w="960"/>
           </w:tcPr>
           <w:p>
             <w:r>
@@ -3667,7 +3902,7 @@
       <w:tr>
         <w:tc>
           <w:tcPr>
-            <w:tcW w:type="dxa" w:w="1080"/>
+            <w:tcW w:type="dxa" w:w="960"/>
           </w:tcPr>
           <w:p>
             <w:r>
@@ -3680,7 +3915,7 @@
         </w:tc>
         <w:tc>
           <w:tcPr>
-            <w:tcW w:type="dxa" w:w="1080"/>
+            <w:tcW w:type="dxa" w:w="960"/>
           </w:tcPr>
           <w:p>
             <w:r>
@@ -3693,7 +3928,7 @@
         </w:tc>
         <w:tc>
           <w:tcPr>
-            <w:tcW w:type="dxa" w:w="1080"/>
+            <w:tcW w:type="dxa" w:w="960"/>
           </w:tcPr>
           <w:p>
             <w:r>
@@ -3706,7 +3941,7 @@
         </w:tc>
         <w:tc>
           <w:tcPr>
-            <w:tcW w:type="dxa" w:w="1080"/>
+            <w:tcW w:type="dxa" w:w="960"/>
           </w:tcPr>
           <w:p>
             <w:r>
@@ -3719,7 +3954,7 @@
         </w:tc>
         <w:tc>
           <w:tcPr>
-            <w:tcW w:type="dxa" w:w="1080"/>
+            <w:tcW w:type="dxa" w:w="960"/>
           </w:tcPr>
           <w:p>
             <w:r>
@@ -3732,7 +3967,7 @@
         </w:tc>
         <w:tc>
           <w:tcPr>
-            <w:tcW w:type="dxa" w:w="1080"/>
+            <w:tcW w:type="dxa" w:w="960"/>
           </w:tcPr>
           <w:p>
             <w:r>
@@ -3745,20 +3980,33 @@
         </w:tc>
         <w:tc>
           <w:tcPr>
-            <w:tcW w:type="dxa" w:w="1080"/>
-          </w:tcPr>
-          <w:p>
-            <w:r>
-              <w:rPr>
-                <w:sz w:val="20"/>
-              </w:rPr>
-              <w:t>12547.5</w:t>
-            </w:r>
-          </w:p>
-        </w:tc>
-        <w:tc>
-          <w:tcPr>
-            <w:tcW w:type="dxa" w:w="1080"/>
+            <w:tcW w:type="dxa" w:w="960"/>
+          </w:tcPr>
+          <w:p>
+            <w:r>
+              <w:rPr>
+                <w:sz w:val="20"/>
+              </w:rPr>
+              <w:t>3351.2</w:t>
+            </w:r>
+          </w:p>
+        </w:tc>
+        <w:tc>
+          <w:tcPr>
+            <w:tcW w:type="dxa" w:w="960"/>
+          </w:tcPr>
+          <w:p>
+            <w:r>
+              <w:rPr>
+                <w:sz w:val="20"/>
+              </w:rPr>
+              <w:t>15898.7</w:t>
+            </w:r>
+          </w:p>
+        </w:tc>
+        <w:tc>
+          <w:tcPr>
+            <w:tcW w:type="dxa" w:w="960"/>
           </w:tcPr>
           <w:p>
             <w:r>
@@ -3773,7 +4021,7 @@
       <w:tr>
         <w:tc>
           <w:tcPr>
-            <w:tcW w:type="dxa" w:w="1080"/>
+            <w:tcW w:type="dxa" w:w="960"/>
           </w:tcPr>
           <w:p>
             <w:r>
@@ -3786,7 +4034,7 @@
         </w:tc>
         <w:tc>
           <w:tcPr>
-            <w:tcW w:type="dxa" w:w="1080"/>
+            <w:tcW w:type="dxa" w:w="960"/>
           </w:tcPr>
           <w:p>
             <w:r>
@@ -3799,7 +4047,7 @@
         </w:tc>
         <w:tc>
           <w:tcPr>
-            <w:tcW w:type="dxa" w:w="1080"/>
+            <w:tcW w:type="dxa" w:w="960"/>
           </w:tcPr>
           <w:p>
             <w:r>
@@ -3812,7 +4060,7 @@
         </w:tc>
         <w:tc>
           <w:tcPr>
-            <w:tcW w:type="dxa" w:w="1080"/>
+            <w:tcW w:type="dxa" w:w="960"/>
           </w:tcPr>
           <w:p>
             <w:r>
@@ -3825,7 +4073,7 @@
         </w:tc>
         <w:tc>
           <w:tcPr>
-            <w:tcW w:type="dxa" w:w="1080"/>
+            <w:tcW w:type="dxa" w:w="960"/>
           </w:tcPr>
           <w:p>
             <w:r>
@@ -3838,7 +4086,7 @@
         </w:tc>
         <w:tc>
           <w:tcPr>
-            <w:tcW w:type="dxa" w:w="1080"/>
+            <w:tcW w:type="dxa" w:w="960"/>
           </w:tcPr>
           <w:p>
             <w:r>
@@ -3851,20 +4099,33 @@
         </w:tc>
         <w:tc>
           <w:tcPr>
-            <w:tcW w:type="dxa" w:w="1080"/>
-          </w:tcPr>
-          <w:p>
-            <w:r>
-              <w:rPr>
-                <w:sz w:val="20"/>
-              </w:rPr>
-              <w:t>15684.4</w:t>
-            </w:r>
-          </w:p>
-        </w:tc>
-        <w:tc>
-          <w:tcPr>
-            <w:tcW w:type="dxa" w:w="1080"/>
+            <w:tcW w:type="dxa" w:w="960"/>
+          </w:tcPr>
+          <w:p>
+            <w:r>
+              <w:rPr>
+                <w:sz w:val="20"/>
+              </w:rPr>
+              <w:t>4189.0</w:t>
+            </w:r>
+          </w:p>
+        </w:tc>
+        <w:tc>
+          <w:tcPr>
+            <w:tcW w:type="dxa" w:w="960"/>
+          </w:tcPr>
+          <w:p>
+            <w:r>
+              <w:rPr>
+                <w:sz w:val="20"/>
+              </w:rPr>
+              <w:t>19873.4</w:t>
+            </w:r>
+          </w:p>
+        </w:tc>
+        <w:tc>
+          <w:tcPr>
+            <w:tcW w:type="dxa" w:w="960"/>
           </w:tcPr>
           <w:p>
             <w:r>
@@ -3879,7 +4140,7 @@
       <w:tr>
         <w:tc>
           <w:tcPr>
-            <w:tcW w:type="dxa" w:w="1080"/>
+            <w:tcW w:type="dxa" w:w="960"/>
           </w:tcPr>
           <w:p>
             <w:r>
@@ -3892,7 +4153,7 @@
         </w:tc>
         <w:tc>
           <w:tcPr>
-            <w:tcW w:type="dxa" w:w="1080"/>
+            <w:tcW w:type="dxa" w:w="960"/>
           </w:tcPr>
           <w:p>
             <w:r>
@@ -3905,7 +4166,7 @@
         </w:tc>
         <w:tc>
           <w:tcPr>
-            <w:tcW w:type="dxa" w:w="1080"/>
+            <w:tcW w:type="dxa" w:w="960"/>
           </w:tcPr>
           <w:p>
             <w:r>
@@ -3918,7 +4179,7 @@
         </w:tc>
         <w:tc>
           <w:tcPr>
-            <w:tcW w:type="dxa" w:w="1080"/>
+            <w:tcW w:type="dxa" w:w="960"/>
           </w:tcPr>
           <w:p>
             <w:r>
@@ -3931,7 +4192,7 @@
         </w:tc>
         <w:tc>
           <w:tcPr>
-            <w:tcW w:type="dxa" w:w="1080"/>
+            <w:tcW w:type="dxa" w:w="960"/>
           </w:tcPr>
           <w:p>
             <w:r>
@@ -3944,7 +4205,7 @@
         </w:tc>
         <w:tc>
           <w:tcPr>
-            <w:tcW w:type="dxa" w:w="1080"/>
+            <w:tcW w:type="dxa" w:w="960"/>
           </w:tcPr>
           <w:p>
             <w:r>
@@ -3957,20 +4218,33 @@
         </w:tc>
         <w:tc>
           <w:tcPr>
-            <w:tcW w:type="dxa" w:w="1080"/>
-          </w:tcPr>
-          <w:p>
-            <w:r>
-              <w:rPr>
-                <w:sz w:val="20"/>
-              </w:rPr>
-              <w:t>18821.3</w:t>
-            </w:r>
-          </w:p>
-        </w:tc>
-        <w:tc>
-          <w:tcPr>
-            <w:tcW w:type="dxa" w:w="1080"/>
+            <w:tcW w:type="dxa" w:w="960"/>
+          </w:tcPr>
+          <w:p>
+            <w:r>
+              <w:rPr>
+                <w:sz w:val="20"/>
+              </w:rPr>
+              <w:t>5026.8</w:t>
+            </w:r>
+          </w:p>
+        </w:tc>
+        <w:tc>
+          <w:tcPr>
+            <w:tcW w:type="dxa" w:w="960"/>
+          </w:tcPr>
+          <w:p>
+            <w:r>
+              <w:rPr>
+                <w:sz w:val="20"/>
+              </w:rPr>
+              <w:t>23848.1</w:t>
+            </w:r>
+          </w:p>
+        </w:tc>
+        <w:tc>
+          <w:tcPr>
+            <w:tcW w:type="dxa" w:w="960"/>
           </w:tcPr>
           <w:p>
             <w:r>
@@ -3985,7 +4259,7 @@
       <w:tr>
         <w:tc>
           <w:tcPr>
-            <w:tcW w:type="dxa" w:w="1080"/>
+            <w:tcW w:type="dxa" w:w="960"/>
           </w:tcPr>
           <w:p>
             <w:r>
@@ -3998,7 +4272,7 @@
         </w:tc>
         <w:tc>
           <w:tcPr>
-            <w:tcW w:type="dxa" w:w="1080"/>
+            <w:tcW w:type="dxa" w:w="960"/>
           </w:tcPr>
           <w:p>
             <w:r>
@@ -4011,7 +4285,7 @@
         </w:tc>
         <w:tc>
           <w:tcPr>
-            <w:tcW w:type="dxa" w:w="1080"/>
+            <w:tcW w:type="dxa" w:w="960"/>
           </w:tcPr>
           <w:p>
             <w:r>
@@ -4024,7 +4298,7 @@
         </w:tc>
         <w:tc>
           <w:tcPr>
-            <w:tcW w:type="dxa" w:w="1080"/>
+            <w:tcW w:type="dxa" w:w="960"/>
           </w:tcPr>
           <w:p>
             <w:r>
@@ -4037,7 +4311,7 @@
         </w:tc>
         <w:tc>
           <w:tcPr>
-            <w:tcW w:type="dxa" w:w="1080"/>
+            <w:tcW w:type="dxa" w:w="960"/>
           </w:tcPr>
           <w:p>
             <w:r>
@@ -4050,7 +4324,7 @@
         </w:tc>
         <w:tc>
           <w:tcPr>
-            <w:tcW w:type="dxa" w:w="1080"/>
+            <w:tcW w:type="dxa" w:w="960"/>
           </w:tcPr>
           <w:p>
             <w:r>
@@ -4063,20 +4337,33 @@
         </w:tc>
         <w:tc>
           <w:tcPr>
-            <w:tcW w:type="dxa" w:w="1080"/>
-          </w:tcPr>
-          <w:p>
-            <w:r>
-              <w:rPr>
-                <w:sz w:val="20"/>
-              </w:rPr>
-              <w:t>21958.2</w:t>
-            </w:r>
-          </w:p>
-        </w:tc>
-        <w:tc>
-          <w:tcPr>
-            <w:tcW w:type="dxa" w:w="1080"/>
+            <w:tcW w:type="dxa" w:w="960"/>
+          </w:tcPr>
+          <w:p>
+            <w:r>
+              <w:rPr>
+                <w:sz w:val="20"/>
+              </w:rPr>
+              <w:t>5864.6</w:t>
+            </w:r>
+          </w:p>
+        </w:tc>
+        <w:tc>
+          <w:tcPr>
+            <w:tcW w:type="dxa" w:w="960"/>
+          </w:tcPr>
+          <w:p>
+            <w:r>
+              <w:rPr>
+                <w:sz w:val="20"/>
+              </w:rPr>
+              <w:t>27822.8</w:t>
+            </w:r>
+          </w:p>
+        </w:tc>
+        <w:tc>
+          <w:tcPr>
+            <w:tcW w:type="dxa" w:w="960"/>
           </w:tcPr>
           <w:p>
             <w:r>
@@ -4091,7 +4378,7 @@
       <w:tr>
         <w:tc>
           <w:tcPr>
-            <w:tcW w:type="dxa" w:w="1080"/>
+            <w:tcW w:type="dxa" w:w="960"/>
           </w:tcPr>
           <w:p>
             <w:r>
@@ -4104,7 +4391,7 @@
         </w:tc>
         <w:tc>
           <w:tcPr>
-            <w:tcW w:type="dxa" w:w="1080"/>
+            <w:tcW w:type="dxa" w:w="960"/>
           </w:tcPr>
           <w:p>
             <w:r>
@@ -4117,7 +4404,7 @@
         </w:tc>
         <w:tc>
           <w:tcPr>
-            <w:tcW w:type="dxa" w:w="1080"/>
+            <w:tcW w:type="dxa" w:w="960"/>
           </w:tcPr>
           <w:p>
             <w:r>
@@ -4130,7 +4417,7 @@
         </w:tc>
         <w:tc>
           <w:tcPr>
-            <w:tcW w:type="dxa" w:w="1080"/>
+            <w:tcW w:type="dxa" w:w="960"/>
           </w:tcPr>
           <w:p>
             <w:r>
@@ -4143,7 +4430,7 @@
         </w:tc>
         <w:tc>
           <w:tcPr>
-            <w:tcW w:type="dxa" w:w="1080"/>
+            <w:tcW w:type="dxa" w:w="960"/>
           </w:tcPr>
           <w:p>
             <w:r>
@@ -4156,7 +4443,7 @@
         </w:tc>
         <w:tc>
           <w:tcPr>
-            <w:tcW w:type="dxa" w:w="1080"/>
+            <w:tcW w:type="dxa" w:w="960"/>
           </w:tcPr>
           <w:p>
             <w:r>
@@ -4169,20 +4456,33 @@
         </w:tc>
         <w:tc>
           <w:tcPr>
-            <w:tcW w:type="dxa" w:w="1080"/>
-          </w:tcPr>
-          <w:p>
-            <w:r>
-              <w:rPr>
-                <w:sz w:val="20"/>
-              </w:rPr>
-              <w:t>25095.1</w:t>
-            </w:r>
-          </w:p>
-        </w:tc>
-        <w:tc>
-          <w:tcPr>
-            <w:tcW w:type="dxa" w:w="1080"/>
+            <w:tcW w:type="dxa" w:w="960"/>
+          </w:tcPr>
+          <w:p>
+            <w:r>
+              <w:rPr>
+                <w:sz w:val="20"/>
+              </w:rPr>
+              <w:t>6702.4</w:t>
+            </w:r>
+          </w:p>
+        </w:tc>
+        <w:tc>
+          <w:tcPr>
+            <w:tcW w:type="dxa" w:w="960"/>
+          </w:tcPr>
+          <w:p>
+            <w:r>
+              <w:rPr>
+                <w:sz w:val="20"/>
+              </w:rPr>
+              <w:t>31797.5</w:t>
+            </w:r>
+          </w:p>
+        </w:tc>
+        <w:tc>
+          <w:tcPr>
+            <w:tcW w:type="dxa" w:w="960"/>
           </w:tcPr>
           <w:p>
             <w:r>
@@ -4197,7 +4497,7 @@
       <w:tr>
         <w:tc>
           <w:tcPr>
-            <w:tcW w:type="dxa" w:w="1080"/>
+            <w:tcW w:type="dxa" w:w="960"/>
           </w:tcPr>
           <w:p>
             <w:r>
@@ -4210,7 +4510,7 @@
         </w:tc>
         <w:tc>
           <w:tcPr>
-            <w:tcW w:type="dxa" w:w="1080"/>
+            <w:tcW w:type="dxa" w:w="960"/>
           </w:tcPr>
           <w:p>
             <w:r>
@@ -4223,7 +4523,7 @@
         </w:tc>
         <w:tc>
           <w:tcPr>
-            <w:tcW w:type="dxa" w:w="1080"/>
+            <w:tcW w:type="dxa" w:w="960"/>
           </w:tcPr>
           <w:p>
             <w:r>
@@ -4236,7 +4536,7 @@
         </w:tc>
         <w:tc>
           <w:tcPr>
-            <w:tcW w:type="dxa" w:w="1080"/>
+            <w:tcW w:type="dxa" w:w="960"/>
           </w:tcPr>
           <w:p>
             <w:r>
@@ -4249,7 +4549,7 @@
         </w:tc>
         <w:tc>
           <w:tcPr>
-            <w:tcW w:type="dxa" w:w="1080"/>
+            <w:tcW w:type="dxa" w:w="960"/>
           </w:tcPr>
           <w:p>
             <w:r>
@@ -4262,7 +4562,7 @@
         </w:tc>
         <w:tc>
           <w:tcPr>
-            <w:tcW w:type="dxa" w:w="1080"/>
+            <w:tcW w:type="dxa" w:w="960"/>
           </w:tcPr>
           <w:p>
             <w:r>
@@ -4275,20 +4575,33 @@
         </w:tc>
         <w:tc>
           <w:tcPr>
-            <w:tcW w:type="dxa" w:w="1080"/>
-          </w:tcPr>
-          <w:p>
-            <w:r>
-              <w:rPr>
-                <w:sz w:val="20"/>
-              </w:rPr>
-              <w:t>28231.9</w:t>
-            </w:r>
-          </w:p>
-        </w:tc>
-        <w:tc>
-          <w:tcPr>
-            <w:tcW w:type="dxa" w:w="1080"/>
+            <w:tcW w:type="dxa" w:w="960"/>
+          </w:tcPr>
+          <w:p>
+            <w:r>
+              <w:rPr>
+                <w:sz w:val="20"/>
+              </w:rPr>
+              <w:t>7540.2</w:t>
+            </w:r>
+          </w:p>
+        </w:tc>
+        <w:tc>
+          <w:tcPr>
+            <w:tcW w:type="dxa" w:w="960"/>
+          </w:tcPr>
+          <w:p>
+            <w:r>
+              <w:rPr>
+                <w:sz w:val="20"/>
+              </w:rPr>
+              <w:t>35772.1</w:t>
+            </w:r>
+          </w:p>
+        </w:tc>
+        <w:tc>
+          <w:tcPr>
+            <w:tcW w:type="dxa" w:w="960"/>
           </w:tcPr>
           <w:p>
             <w:r>
@@ -4303,7 +4616,7 @@
       <w:tr>
         <w:tc>
           <w:tcPr>
-            <w:tcW w:type="dxa" w:w="1080"/>
+            <w:tcW w:type="dxa" w:w="960"/>
           </w:tcPr>
           <w:p>
             <w:r>
@@ -4316,7 +4629,7 @@
         </w:tc>
         <w:tc>
           <w:tcPr>
-            <w:tcW w:type="dxa" w:w="1080"/>
+            <w:tcW w:type="dxa" w:w="960"/>
           </w:tcPr>
           <w:p>
             <w:r>
@@ -4329,7 +4642,7 @@
         </w:tc>
         <w:tc>
           <w:tcPr>
-            <w:tcW w:type="dxa" w:w="1080"/>
+            <w:tcW w:type="dxa" w:w="960"/>
           </w:tcPr>
           <w:p>
             <w:r>
@@ -4342,7 +4655,7 @@
         </w:tc>
         <w:tc>
           <w:tcPr>
-            <w:tcW w:type="dxa" w:w="1080"/>
+            <w:tcW w:type="dxa" w:w="960"/>
           </w:tcPr>
           <w:p>
             <w:r>
@@ -4355,7 +4668,7 @@
         </w:tc>
         <w:tc>
           <w:tcPr>
-            <w:tcW w:type="dxa" w:w="1080"/>
+            <w:tcW w:type="dxa" w:w="960"/>
           </w:tcPr>
           <w:p>
             <w:r>
@@ -4368,7 +4681,7 @@
         </w:tc>
         <w:tc>
           <w:tcPr>
-            <w:tcW w:type="dxa" w:w="1080"/>
+            <w:tcW w:type="dxa" w:w="960"/>
           </w:tcPr>
           <w:p>
             <w:r>
@@ -4381,20 +4694,33 @@
         </w:tc>
         <w:tc>
           <w:tcPr>
-            <w:tcW w:type="dxa" w:w="1080"/>
-          </w:tcPr>
-          <w:p>
-            <w:r>
-              <w:rPr>
-                <w:sz w:val="20"/>
-              </w:rPr>
-              <w:t>31368.8</w:t>
-            </w:r>
-          </w:p>
-        </w:tc>
-        <w:tc>
-          <w:tcPr>
-            <w:tcW w:type="dxa" w:w="1080"/>
+            <w:tcW w:type="dxa" w:w="960"/>
+          </w:tcPr>
+          <w:p>
+            <w:r>
+              <w:rPr>
+                <w:sz w:val="20"/>
+              </w:rPr>
+              <w:t>8378.0</w:t>
+            </w:r>
+          </w:p>
+        </w:tc>
+        <w:tc>
+          <w:tcPr>
+            <w:tcW w:type="dxa" w:w="960"/>
+          </w:tcPr>
+          <w:p>
+            <w:r>
+              <w:rPr>
+                <w:sz w:val="20"/>
+              </w:rPr>
+              <w:t>39746.8</w:t>
+            </w:r>
+          </w:p>
+        </w:tc>
+        <w:tc>
+          <w:tcPr>
+            <w:tcW w:type="dxa" w:w="960"/>
           </w:tcPr>
           <w:p>
             <w:r>

</xml_diff>